<commit_message>
Replace campaign designs with October 29 team-supplied imagery
</commit_message>
<xml_diff>
--- a/assets/02-Campaign-plan/Willies-November-December-Campaign.docx
+++ b/assets/02-Campaign-plan/Willies-November-December-Campaign.docx
@@ -62,7 +62,7 @@
           <w:sz w:val="22"/>
           <w:szCs w:val="22"/>
         </w:rPr>
-        <w:t xml:space="preserve">Plan. Don’t Ban. remains the campaign message. Keep Willie photography, black and cream, and the Goodness of Hemp logo consistent. Match Willie’s rounded navy button outline and lower shadow, with GOH lime as the fill and a right arrow after Tell Congress.</w:t>
+        <w:t xml:space="preserve">Plan. Don’t Ban. remains the campaign message. Use Forrest’s supplied Willie photography, black and cream, and the Goodness of Hemp logo. Match Willie’s rounded navy button outline and lower shadow, with GOH lime as the fill and a right arrow after Tell Congress.</w:t>
       </w:r>
     </w:p>
     <w:p>
@@ -695,7 +695,7 @@
                 <w:sz w:val="20"/>
                 <w:szCs w:val="20"/>
               </w:rPr>
-              <w:t xml:space="preserve">Treatment 2 with the warm Willie portrait</w:t>
+              <w:t xml:space="preserve">Treatment 2 with the supplied performance photo</w:t>
             </w:r>
           </w:p>
         </w:tc>
@@ -4757,6 +4757,20 @@
           <w:sz w:val="22"/>
           <w:szCs w:val="22"/>
         </w:rPr>
+        <w:t xml:space="preserve">Final artwork, copy, and promotion details require approval from Willie’s team before publication, sending, or scheduling. Forrest supplied the campaign photography for creative development. The asset register records the selected photographs and the other supplied files.</w:t>
+      </w:r>
+    </w:p>
+    <w:p>
+      <w:pPr>
+        <w:spacing w:after="120" w:line="276"/>
+      </w:pPr>
+      <w:r>
+        <w:rPr>
+          <w:rFonts w:ascii="Arial" w:cs="Arial" w:eastAsia="Arial" w:hAnsi="Arial"/>
+          <w:color w:val="000000"/>
+          <w:sz w:val="22"/>
+          <w:szCs w:val="22"/>
+        </w:rPr>
         <w:t xml:space="preserve">The customer facing artwork and email files contain the short signed bottle invitation. Set the confirmed entry window, eligible locations, prize details, and rules link before launch. Use the same approved action and entry experience for email and social. A purchase does not replace the advocacy action.</w:t>
       </w:r>
     </w:p>
@@ -4919,7 +4933,7 @@
           <w:sz w:val="22"/>
           <w:szCs w:val="22"/>
         </w:rPr>
-        <w:t xml:space="preserve">The companion campaign package contains six dated email folders with HTML, image previews, and editable copy, plus the social treatments, carousel exports, and captions. The HTML is prepared for team handoff in the approved design. Willie’s email provider should supply its live preference and unsubscribe links.</w:t>
+        <w:t xml:space="preserve">The companion campaign package contains six dated email folders with HTML, image previews, and editable copy, plus the social treatments, carousel exports, and captions. The HTML is prepared for Willie’s team to review. Willie’s email provider should supply its live preference and unsubscribe links.</w:t>
       </w:r>
     </w:p>
     <w:p>

</xml_diff>